<commit_message>
Added tests and documentation end_to_end
</commit_message>
<xml_diff>
--- a/Resources/REACT_Pipeline_Runbook.docx
+++ b/Resources/REACT_Pipeline_Runbook.docx
@@ -160,10 +160,18 @@
       </w:pPr>
       <w:r>
         <w:rPr>
+          <w:b/>
           <w:color w:val="444444"/>
           <w:sz w:val="20"/>
         </w:rPr>
-        <w:t xml:space="preserve">App name (from </w:t>
+        <w:t>Two different names, confirmed as of 2026-07-21-23:</w:t>
+      </w:r>
+      <w:r>
+        <w:rPr>
+          <w:color w:val="444444"/>
+          <w:sz w:val="20"/>
+        </w:rPr>
+        <w:t xml:space="preserve"> the web-facing hostname (</w:t>
       </w:r>
       <w:r>
         <w:rPr>
@@ -178,7 +186,7 @@
           <w:color w:val="444444"/>
           <w:sz w:val="20"/>
         </w:rPr>
-        <w:t xml:space="preserve"> and </w:t>
+        <w:t xml:space="preserve">, </w:t>
       </w:r>
       <w:r>
         <w:rPr>
@@ -193,7 +201,7 @@
           <w:color w:val="444444"/>
           <w:sz w:val="20"/>
         </w:rPr>
-        <w:t xml:space="preserve">): </w:t>
+        <w:t xml:space="preserve">) is </w:t>
       </w:r>
       <w:r>
         <w:rPr>
@@ -201,14 +209,14 @@
           <w:color w:val="1A1A2E"/>
           <w:sz w:val="20"/>
         </w:rPr>
-        <w:t>healthygatorsportfan-ab9271b02569</w:t>
+        <w:t>healthygatorsportfan-ab9271b02569.herokuapp.com</w:t>
       </w:r>
       <w:r>
         <w:rPr>
           <w:color w:val="444444"/>
           <w:sz w:val="20"/>
         </w:rPr>
-        <w:t xml:space="preserve">. Confirm this is still current with </w:t>
+        <w:t xml:space="preserve"> — that one works fine over HTTP, no CLI needed. But </w:t>
       </w:r>
       <w:r>
         <w:rPr>
@@ -216,14 +224,14 @@
           <w:color w:val="1A1A2E"/>
           <w:sz w:val="20"/>
         </w:rPr>
-        <w:t>heroku apps</w:t>
+        <w:t>heroku</w:t>
       </w:r>
       <w:r>
         <w:rPr>
           <w:color w:val="444444"/>
           <w:sz w:val="20"/>
         </w:rPr>
-        <w:t xml:space="preserve"> — </w:t>
+        <w:t xml:space="preserve"> CLI commands (</w:t>
       </w:r>
       <w:r>
         <w:rPr>
@@ -231,14 +239,14 @@
           <w:color w:val="1A1A2E"/>
           <w:sz w:val="20"/>
         </w:rPr>
-        <w:t>ALLOWED_HOSTS</w:t>
+        <w:t>-a healthygatorsportfan-ab9271b02569</w:t>
       </w:r>
       <w:r>
         <w:rPr>
           <w:color w:val="444444"/>
           <w:sz w:val="20"/>
         </w:rPr>
-        <w:t xml:space="preserve"> in </w:t>
+        <w:t xml:space="preserve">) fail with "Couldn't find that app" — the CLI/API only recognizes the app under the name </w:t>
       </w:r>
       <w:r>
         <w:rPr>
@@ -246,14 +254,104 @@
           <w:color w:val="1A1A2E"/>
           <w:sz w:val="20"/>
         </w:rPr>
-        <w:t>project/settings.py</w:t>
+        <w:t>healthygatorsportfan</w:t>
       </w:r>
       <w:r>
         <w:rPr>
           <w:color w:val="444444"/>
           <w:sz w:val="20"/>
         </w:rPr>
-        <w:t xml:space="preserve"> actually lists three different hostnames, likely leftover from a rename, so don't assume without checking.</w:t>
+        <w:t xml:space="preserve"> (no suffix). Querying </w:t>
+      </w:r>
+      <w:r>
+        <w:rPr>
+          <w:rFonts w:ascii="Courier New" w:hAnsi="Courier New"/>
+          <w:color w:val="1A1A2E"/>
+          <w:sz w:val="20"/>
+        </w:rPr>
+        <w:t>app_user</w:t>
+      </w:r>
+      <w:r>
+        <w:rPr>
+          <w:color w:val="444444"/>
+          <w:sz w:val="20"/>
+        </w:rPr>
+        <w:t xml:space="preserve"> directly confirmed both names lead to the *same database* (test users created via the HTTP hostname show up when queried through the CLI app name), so </w:t>
+      </w:r>
+      <w:r>
+        <w:rPr>
+          <w:b/>
+          <w:color w:val="444444"/>
+          <w:sz w:val="20"/>
+        </w:rPr>
+        <w:t>use `healthygatorsportfan` for every `heroku` CLI command below</w:t>
+      </w:r>
+      <w:r>
+        <w:rPr>
+          <w:color w:val="444444"/>
+          <w:sz w:val="20"/>
+        </w:rPr>
+        <w:t xml:space="preserve">, and the </w:t>
+      </w:r>
+      <w:r>
+        <w:rPr>
+          <w:rFonts w:ascii="Courier New" w:hAnsi="Courier New"/>
+          <w:color w:val="1A1A2E"/>
+          <w:sz w:val="20"/>
+        </w:rPr>
+        <w:t>-ab9271b02569</w:t>
+      </w:r>
+      <w:r>
+        <w:rPr>
+          <w:color w:val="444444"/>
+          <w:sz w:val="20"/>
+        </w:rPr>
+        <w:t xml:space="preserve"> hostname only for HTTP/</w:t>
+      </w:r>
+      <w:r>
+        <w:rPr>
+          <w:rFonts w:ascii="Courier New" w:hAnsi="Courier New"/>
+          <w:color w:val="1A1A2E"/>
+          <w:sz w:val="20"/>
+        </w:rPr>
+        <w:t>--base-url</w:t>
+      </w:r>
+      <w:r>
+        <w:rPr>
+          <w:color w:val="444444"/>
+          <w:sz w:val="20"/>
+        </w:rPr>
+        <w:t xml:space="preserve">. Still unconfirmed whether </w:t>
+      </w:r>
+      <w:r>
+        <w:rPr>
+          <w:rFonts w:ascii="Courier New" w:hAnsi="Courier New"/>
+          <w:color w:val="1A1A2E"/>
+          <w:sz w:val="20"/>
+        </w:rPr>
+        <w:t>healthygatorsportfan</w:t>
+      </w:r>
+      <w:r>
+        <w:rPr>
+          <w:color w:val="444444"/>
+          <w:sz w:val="20"/>
+        </w:rPr>
+        <w:t xml:space="preserve">'s dynos are running the same code as what's live at the HTTP hostname (possible this is a rename with one app, possible it's two apps sharing one Postgres add-on) — </w:t>
+      </w:r>
+      <w:r>
+        <w:rPr>
+          <w:rFonts w:ascii="Courier New" w:hAnsi="Courier New"/>
+          <w:color w:val="1A1A2E"/>
+          <w:sz w:val="20"/>
+        </w:rPr>
+        <w:t>heroku releases -a healthygatorsportfan</w:t>
+      </w:r>
+      <w:r>
+        <w:rPr>
+          <w:color w:val="444444"/>
+          <w:sz w:val="20"/>
+        </w:rPr>
+        <w:t xml:space="preserve"> should settle it; do that before trusting a deploy here to actually update what's live.</w:t>
       </w:r>
     </w:p>
     <w:p>
@@ -310,7 +408,7 @@
           <w:color w:val="1A1A2E"/>
           <w:sz w:val="17"/>
         </w:rPr>
-        <w:t>heroku git:remote -a healthygatorsportfan-ab9271b02569</w:t>
+        <w:t>heroku git:remote -a healthygatorsportfan</w:t>
       </w:r>
     </w:p>
     <w:p>
@@ -352,9 +450,9 @@
         </w:rPr>
         <w:t>git push heroku main        # or push to origin/main if this app auto-deploys from GitHub</w:t>
         <w:br/>
-        <w:t>heroku releases -a healthygatorsportfan-ab9271b02569       # confirm the release step succeeded</w:t>
+        <w:t>heroku releases -a healthygatorsportfan       # confirm the release step succeeded</w:t>
         <w:br/>
-        <w:t>heroku run python manage.py showmigrations app -a healthygatorsportfan-ab9271b02569   # sanity-check migrate ran</w:t>
+        <w:t>heroku run python manage.py showmigrations app -a healthygatorsportfan   # sanity-check migrate ran</w:t>
       </w:r>
     </w:p>
     <w:p>
@@ -681,9 +779,9 @@
           <w:color w:val="1A1A2E"/>
           <w:sz w:val="17"/>
         </w:rPr>
-        <w:t>heroku ps -a healthygatorsportfan-ab9271b02569               # confirm web, worker, beat are all up</w:t>
+        <w:t>heroku ps -a healthygatorsportfan               # confirm web, worker, beat are all up</w:t>
         <w:br/>
-        <w:t>heroku ps:scale -a healthygatorsportfan-ab9271b02569          # how many of each are provisioned</w:t>
+        <w:t>heroku ps:scale -a healthygatorsportfan          # how many of each are provisioned</w:t>
       </w:r>
     </w:p>
     <w:p>
@@ -783,9 +881,9 @@
           <w:color w:val="1A1A2E"/>
           <w:sz w:val="17"/>
         </w:rPr>
-        <w:t>heroku logs --tail --dyno=worker -a healthygatorsportfan-ab9271b02569</w:t>
+        <w:t>heroku logs --tail --dyno=worker -a healthygatorsportfan</w:t>
         <w:br/>
-        <w:t>heroku logs --tail --dyno=beat -a healthygatorsportfan-ab9271b02569</w:t>
+        <w:t>heroku logs --tail --dyno=beat -a healthygatorsportfan</w:t>
       </w:r>
     </w:p>
     <w:p>
@@ -1082,6 +1180,63 @@
           <w:sz w:val="20"/>
         </w:rPr>
         <w:t>The first test user is always left without a push token on purpose — that's step 7's "missing token" case. Verified working end to end against a local backend + worker + beat (2026-07-21) before ever pointing it at production.</w:t>
+      </w:r>
+    </w:p>
+    <w:p>
+      <w:pPr>
+        <w:spacing w:after="80"/>
+      </w:pPr>
+      <w:r>
+        <w:rPr>
+          <w:color w:val="444444"/>
+          <w:sz w:val="20"/>
+        </w:rPr>
+        <w:t xml:space="preserve">Add </w:t>
+      </w:r>
+      <w:r>
+        <w:rPr>
+          <w:rFonts w:ascii="Courier New" w:hAnsi="Courier New"/>
+          <w:color w:val="1A1A2E"/>
+          <w:sz w:val="20"/>
+        </w:rPr>
+        <w:t>--restart-worker healthygatorsportfan</w:t>
+      </w:r>
+      <w:r>
+        <w:rPr>
+          <w:color w:val="444444"/>
+          <w:sz w:val="20"/>
+        </w:rPr>
+        <w:t xml:space="preserve"> to run </w:t>
+      </w:r>
+      <w:r>
+        <w:rPr>
+          <w:rFonts w:ascii="Courier New" w:hAnsi="Courier New"/>
+          <w:color w:val="1A1A2E"/>
+          <w:sz w:val="20"/>
+        </w:rPr>
+        <w:t>heroku ps:restart worker -a healthygatorsportfan</w:t>
+      </w:r>
+      <w:r>
+        <w:rPr>
+          <w:color w:val="444444"/>
+          <w:sz w:val="20"/>
+        </w:rPr>
+        <w:t xml:space="preserve"> right after seeding, before polling starts — this is the reproducible, single-command way to run step 7's "worker killed and restarted, no duplicate" case: the worker dyno bounces while the EMAs are sitting unprocessed, and the first beat tick after that has to hit a freshly-restarted worker with no duplicate </w:t>
+      </w:r>
+      <w:r>
+        <w:rPr>
+          <w:rFonts w:ascii="Courier New" w:hAnsi="Courier New"/>
+          <w:color w:val="1A1A2E"/>
+          <w:sz w:val="20"/>
+        </w:rPr>
+        <w:t>JITAILog</w:t>
+      </w:r>
+      <w:r>
+        <w:rPr>
+          <w:color w:val="444444"/>
+          <w:sz w:val="20"/>
+        </w:rPr>
+        <w:t xml:space="preserve"> rows to show for it.</w:t>
       </w:r>
     </w:p>
     <w:p>
@@ -1638,7 +1793,7 @@
                 <w:color w:val="1A1A2E"/>
                 <w:sz w:val="18"/>
               </w:rPr>
-              <w:t>heroku ps:restart worker -a healthygatorsportfan-ab9271b02569</w:t>
+              <w:t>heroku ps:restart worker -a healthygatorsportfan</w:t>
             </w:r>
             <w:r>
               <w:rPr>
@@ -1740,7 +1895,7 @@
           <w:color w:val="1A1A2E"/>
           <w:sz w:val="17"/>
         </w:rPr>
-        <w:t>heroku run python manage.py shell -a healthygatorsportfan-ab9271b02569 -- -c "</w:t>
+        <w:t>heroku run python manage.py shell -a healthygatorsportfan -- -c "</w:t>
         <w:br/>
         <w:t>from app.models import JITAILog</w:t>
         <w:br/>

</xml_diff>